<commit_message>
Docs: Add-On Modules white paper with status update; User Guide new tools
Co-Authored-By: Claude Fable 5.1 <noreply@anthropic.com>
Claude-Session: https://claude.ai/code/session_01JPZJaTbXQFN2qiYRf4rkZK
</commit_message>
<xml_diff>
--- a/docs/Next_Owner_Market_User_Guide.docx
+++ b/docs/Next_Owner_Market_User_Guide.docx
@@ -4891,6 +4891,96 @@
         <w:t xml:space="preserve">: real reviews from completed orders, and a three-step "How it works" (pay by card, money held, pick up or ship).</w:t>
       </w:r>
     </w:p>
+    <w:p>
+      <w:pPr>
+        <w:pStyle w:val="FirstParagraph"/>
+      </w:pPr>
+      <w:r>
+        <w:rPr>
+          <w:bCs/>
+          <w:b/>
+        </w:rPr>
+        <w:t xml:space="preserve">Three more tools (evening of Sept 30)</w:t>
+      </w:r>
+    </w:p>
+    <w:p>
+      <w:pPr>
+        <w:numPr>
+          <w:ilvl w:val="0"/>
+          <w:numId w:val="1021"/>
+        </w:numPr>
+        <w:pStyle w:val="Compact"/>
+      </w:pPr>
+      <w:r>
+        <w:rPr>
+          <w:bCs/>
+          <w:b/>
+        </w:rPr>
+        <w:t xml:space="preserve">Sort the pile</w:t>
+      </w:r>
+      <w:r>
+        <w:t xml:space="preserve"> </w:t>
+      </w:r>
+      <w:r>
+        <w:t xml:space="preserve">(nextownermarket.com/pile): photograph a box, shelf, or garage corner (up to 10 photos). Every item comes back with a value range and Keep / Sell / Donate / Toss, with a reason. Change any label. "List N items" turns the Sell ones into draft listings with photo, title, description, and price. Uses AI credits like Worth.</w:t>
+      </w:r>
+    </w:p>
+    <w:p>
+      <w:pPr>
+        <w:numPr>
+          <w:ilvl w:val="0"/>
+          <w:numId w:val="1021"/>
+        </w:numPr>
+        <w:pStyle w:val="Compact"/>
+      </w:pPr>
+      <w:r>
+        <w:rPr>
+          <w:bCs/>
+          <w:b/>
+        </w:rPr>
+        <w:t xml:space="preserve">Buy or pass?</w:t>
+      </w:r>
+      <w:r>
+        <w:t xml:space="preserve"> </w:t>
+      </w:r>
+      <w:r>
+        <w:t xml:space="preserve">(nextownermarket.com/buy-or-pass): in a thrift store, one photo plus what they're asking. You get resale range, best place to sell, fees, shipping, profit, and BUY / MAYBE / PASS.</w:t>
+      </w:r>
+    </w:p>
+    <w:p>
+      <w:pPr>
+        <w:numPr>
+          <w:ilvl w:val="0"/>
+          <w:numId w:val="1021"/>
+        </w:numPr>
+        <w:pStyle w:val="Compact"/>
+      </w:pPr>
+      <w:r>
+        <w:rPr>
+          <w:bCs/>
+          <w:b/>
+        </w:rPr>
+        <w:t xml:space="preserve">Year summary</w:t>
+      </w:r>
+      <w:r>
+        <w:t xml:space="preserve"> </w:t>
+      </w:r>
+      <w:r>
+        <w:t xml:space="preserve">(📊 Year in the seller app): sales, shipping collected, fees, commissions, labels paid, cost of goods, net, per year, with CSV download for your tax preparer. It's a summary, not tax advice, and we don't file anything.</w:t>
+      </w:r>
+    </w:p>
+    <w:p>
+      <w:pPr>
+        <w:numPr>
+          <w:ilvl w:val="0"/>
+          <w:numId w:val="1021"/>
+        </w:numPr>
+        <w:pStyle w:val="Compact"/>
+      </w:pPr>
+      <w:r>
+        <w:t xml:space="preserve">Help now has "How do I spot a scam in a marketplace deal?"</w:t>
+      </w:r>
+    </w:p>
     <w:bookmarkEnd w:id="55"/>
     <w:bookmarkStart w:id="58" w:name="part-7--sharing-the-store"/>
     <w:p>
@@ -4905,7 +4995,7 @@
       <w:pPr>
         <w:numPr>
           <w:ilvl w:val="0"/>
-          <w:numId w:val="1021"/>
+          <w:numId w:val="1022"/>
         </w:numPr>
         <w:pStyle w:val="Compact"/>
       </w:pPr>
@@ -4930,7 +5020,7 @@
       <w:pPr>
         <w:numPr>
           <w:ilvl w:val="0"/>
-          <w:numId w:val="1021"/>
+          <w:numId w:val="1022"/>
         </w:numPr>
         <w:pStyle w:val="Compact"/>
       </w:pPr>
@@ -4942,7 +5032,7 @@
       <w:pPr>
         <w:numPr>
           <w:ilvl w:val="0"/>
-          <w:numId w:val="1021"/>
+          <w:numId w:val="1022"/>
         </w:numPr>
         <w:pStyle w:val="Compact"/>
       </w:pPr>
@@ -4967,7 +5057,7 @@
       <w:pPr>
         <w:numPr>
           <w:ilvl w:val="0"/>
-          <w:numId w:val="1021"/>
+          <w:numId w:val="1022"/>
         </w:numPr>
         <w:pStyle w:val="Compact"/>
       </w:pPr>
@@ -5017,7 +5107,7 @@
       <w:pPr>
         <w:numPr>
           <w:ilvl w:val="0"/>
-          <w:numId w:val="1022"/>
+          <w:numId w:val="1023"/>
         </w:numPr>
         <w:pStyle w:val="Compact"/>
       </w:pPr>
@@ -5029,7 +5119,7 @@
       <w:pPr>
         <w:numPr>
           <w:ilvl w:val="0"/>
-          <w:numId w:val="1022"/>
+          <w:numId w:val="1023"/>
         </w:numPr>
         <w:pStyle w:val="Compact"/>
       </w:pPr>
@@ -5041,7 +5131,7 @@
       <w:pPr>
         <w:numPr>
           <w:ilvl w:val="0"/>
-          <w:numId w:val="1022"/>
+          <w:numId w:val="1023"/>
         </w:numPr>
         <w:pStyle w:val="Compact"/>
       </w:pPr>
@@ -5053,7 +5143,7 @@
       <w:pPr>
         <w:numPr>
           <w:ilvl w:val="0"/>
-          <w:numId w:val="1022"/>
+          <w:numId w:val="1023"/>
         </w:numPr>
         <w:pStyle w:val="Compact"/>
       </w:pPr>
@@ -5065,7 +5155,7 @@
       <w:pPr>
         <w:numPr>
           <w:ilvl w:val="0"/>
-          <w:numId w:val="1022"/>
+          <w:numId w:val="1023"/>
         </w:numPr>
         <w:pStyle w:val="Compact"/>
       </w:pPr>
@@ -5077,7 +5167,7 @@
       <w:pPr>
         <w:numPr>
           <w:ilvl w:val="0"/>
-          <w:numId w:val="1022"/>
+          <w:numId w:val="1023"/>
         </w:numPr>
         <w:pStyle w:val="Compact"/>
       </w:pPr>
@@ -5089,7 +5179,7 @@
       <w:pPr>
         <w:numPr>
           <w:ilvl w:val="0"/>
-          <w:numId w:val="1022"/>
+          <w:numId w:val="1023"/>
         </w:numPr>
         <w:pStyle w:val="Compact"/>
       </w:pPr>
@@ -5101,7 +5191,7 @@
       <w:pPr>
         <w:numPr>
           <w:ilvl w:val="0"/>
-          <w:numId w:val="1022"/>
+          <w:numId w:val="1023"/>
         </w:numPr>
         <w:pStyle w:val="Compact"/>
       </w:pPr>
@@ -5174,7 +5264,7 @@
       <w:pPr>
         <w:numPr>
           <w:ilvl w:val="0"/>
-          <w:numId w:val="1023"/>
+          <w:numId w:val="1024"/>
         </w:numPr>
         <w:pStyle w:val="Compact"/>
       </w:pPr>
@@ -5186,7 +5276,7 @@
       <w:pPr>
         <w:numPr>
           <w:ilvl w:val="0"/>
-          <w:numId w:val="1023"/>
+          <w:numId w:val="1024"/>
         </w:numPr>
         <w:pStyle w:val="Compact"/>
       </w:pPr>
@@ -5198,7 +5288,7 @@
       <w:pPr>
         <w:numPr>
           <w:ilvl w:val="0"/>
-          <w:numId w:val="1023"/>
+          <w:numId w:val="1024"/>
         </w:numPr>
         <w:pStyle w:val="Compact"/>
       </w:pPr>
@@ -5210,7 +5300,7 @@
       <w:pPr>
         <w:numPr>
           <w:ilvl w:val="0"/>
-          <w:numId w:val="1023"/>
+          <w:numId w:val="1024"/>
         </w:numPr>
         <w:pStyle w:val="Compact"/>
       </w:pPr>
@@ -5222,7 +5312,7 @@
       <w:pPr>
         <w:numPr>
           <w:ilvl w:val="0"/>
-          <w:numId w:val="1023"/>
+          <w:numId w:val="1024"/>
         </w:numPr>
         <w:pStyle w:val="Compact"/>
       </w:pPr>
@@ -5677,6 +5767,9 @@
     <w:abstractNumId w:val="991"/>
   </w:num>
   <w:num w:numId="1023">
+    <w:abstractNumId w:val="991"/>
+  </w:num>
+  <w:num w:numId="1024">
     <w:abstractNumId w:val="991"/>
   </w:num>
 </w:numbering>

</xml_diff>

<commit_message>
Docs: Mission Statement, User Guide and White Paper updates
Co-Authored-By: Claude Fable 5.1 <noreply@anthropic.com>
Claude-Session: https://claude.ai/code/session_01JPZJaTbXQFN2qiYRf4rkZK
</commit_message>
<xml_diff>
--- a/docs/Next_Owner_Market_User_Guide.docx
+++ b/docs/Next_Owner_Market_User_Guide.docx
@@ -4981,6 +4981,103 @@
         <w:t xml:space="preserve">Help now has "How do I spot a scam in a marketplace deal?"</w:t>
       </w:r>
     </w:p>
+    <w:p>
+      <w:pPr>
+        <w:pStyle w:val="FirstParagraph"/>
+      </w:pPr>
+      <w:r>
+        <w:rPr>
+          <w:bCs/>
+          <w:b/>
+        </w:rPr>
+        <w:t xml:space="preserve">Teaching pages and the public valuations archive (Sept 30, evening)</w:t>
+      </w:r>
+    </w:p>
+    <w:p>
+      <w:pPr>
+        <w:numPr>
+          <w:ilvl w:val="0"/>
+          <w:numId w:val="1022"/>
+        </w:numPr>
+        <w:pStyle w:val="Compact"/>
+      </w:pPr>
+      <w:r>
+        <w:rPr>
+          <w:bCs/>
+          <w:b/>
+        </w:rPr>
+        <w:t xml:space="preserve">Why we built this</w:t>
+      </w:r>
+      <w:r>
+        <w:t xml:space="preserve"> </w:t>
+      </w:r>
+      <w:r>
+        <w:t xml:space="preserve">(nextownermarket.com/why): the mission statement, in Shayne's words. Linked from the home page, Pro page, tool pages, footer.</w:t>
+      </w:r>
+    </w:p>
+    <w:p>
+      <w:pPr>
+        <w:numPr>
+          <w:ilvl w:val="0"/>
+          <w:numId w:val="1022"/>
+        </w:numPr>
+        <w:pStyle w:val="Compact"/>
+      </w:pPr>
+      <w:r>
+        <w:rPr>
+          <w:bCs/>
+          <w:b/>
+        </w:rPr>
+        <w:t xml:space="preserve">Start with one box</w:t>
+      </w:r>
+      <w:r>
+        <w:t xml:space="preserve"> </w:t>
+      </w:r>
+      <w:r>
+        <w:t xml:space="preserve">(nextownermarket.com/start): the eight-step path for someone overwhelmed by stuff. Pick one box → photograph → Sort the pile → list the Sell ones → set up payouts → copy to Facebook and the rest → hand over safely → next box. Google reads it as a how-to.</w:t>
+      </w:r>
+    </w:p>
+    <w:p>
+      <w:pPr>
+        <w:numPr>
+          <w:ilvl w:val="0"/>
+          <w:numId w:val="1022"/>
+        </w:numPr>
+        <w:pStyle w:val="Compact"/>
+      </w:pPr>
+      <w:r>
+        <w:rPr>
+          <w:bCs/>
+          <w:b/>
+        </w:rPr>
+        <w:t xml:space="preserve">Every tool page now teaches</w:t>
+      </w:r>
+      <w:r>
+        <w:t xml:space="preserve">: What's it worth?, Sort the pile, and Buy or pass? each have a plain-English explanation, numbered steps, real examples, and a Questions people ask section that Google can show directly in results.</w:t>
+      </w:r>
+    </w:p>
+    <w:p>
+      <w:pPr>
+        <w:numPr>
+          <w:ilvl w:val="0"/>
+          <w:numId w:val="1022"/>
+        </w:numPr>
+        <w:pStyle w:val="Compact"/>
+      </w:pPr>
+      <w:r>
+        <w:rPr>
+          <w:bCs/>
+          <w:b/>
+        </w:rPr>
+        <w:t xml:space="preserve">What things are worth</w:t>
+      </w:r>
+      <w:r>
+        <w:t xml:space="preserve"> </w:t>
+      </w:r>
+      <w:r>
+        <w:t xml:space="preserve">(nextownermarket.com/valued): a public archive of valuations people chose to share (no names). After any Worth or Pile result there's a "Share it (no name)" box; tick it and the valuation gets its own page (photo optional). Each page: value range, why, where it sells best, what raises the price, similar items, and a "value mine" button. Every shared item is another page Google can send people to. Owners can hide theirs from My account.</w:t>
+      </w:r>
+    </w:p>
     <w:bookmarkEnd w:id="55"/>
     <w:bookmarkStart w:id="58" w:name="part-7--sharing-the-store"/>
     <w:p>
@@ -4995,7 +5092,7 @@
       <w:pPr>
         <w:numPr>
           <w:ilvl w:val="0"/>
-          <w:numId w:val="1022"/>
+          <w:numId w:val="1023"/>
         </w:numPr>
         <w:pStyle w:val="Compact"/>
       </w:pPr>
@@ -5020,7 +5117,7 @@
       <w:pPr>
         <w:numPr>
           <w:ilvl w:val="0"/>
-          <w:numId w:val="1022"/>
+          <w:numId w:val="1023"/>
         </w:numPr>
         <w:pStyle w:val="Compact"/>
       </w:pPr>
@@ -5032,7 +5129,7 @@
       <w:pPr>
         <w:numPr>
           <w:ilvl w:val="0"/>
-          <w:numId w:val="1022"/>
+          <w:numId w:val="1023"/>
         </w:numPr>
         <w:pStyle w:val="Compact"/>
       </w:pPr>
@@ -5057,7 +5154,7 @@
       <w:pPr>
         <w:numPr>
           <w:ilvl w:val="0"/>
-          <w:numId w:val="1022"/>
+          <w:numId w:val="1023"/>
         </w:numPr>
         <w:pStyle w:val="Compact"/>
       </w:pPr>
@@ -5107,7 +5204,7 @@
       <w:pPr>
         <w:numPr>
           <w:ilvl w:val="0"/>
-          <w:numId w:val="1023"/>
+          <w:numId w:val="1024"/>
         </w:numPr>
         <w:pStyle w:val="Compact"/>
       </w:pPr>
@@ -5119,7 +5216,7 @@
       <w:pPr>
         <w:numPr>
           <w:ilvl w:val="0"/>
-          <w:numId w:val="1023"/>
+          <w:numId w:val="1024"/>
         </w:numPr>
         <w:pStyle w:val="Compact"/>
       </w:pPr>
@@ -5131,7 +5228,7 @@
       <w:pPr>
         <w:numPr>
           <w:ilvl w:val="0"/>
-          <w:numId w:val="1023"/>
+          <w:numId w:val="1024"/>
         </w:numPr>
         <w:pStyle w:val="Compact"/>
       </w:pPr>
@@ -5143,7 +5240,7 @@
       <w:pPr>
         <w:numPr>
           <w:ilvl w:val="0"/>
-          <w:numId w:val="1023"/>
+          <w:numId w:val="1024"/>
         </w:numPr>
         <w:pStyle w:val="Compact"/>
       </w:pPr>
@@ -5155,7 +5252,7 @@
       <w:pPr>
         <w:numPr>
           <w:ilvl w:val="0"/>
-          <w:numId w:val="1023"/>
+          <w:numId w:val="1024"/>
         </w:numPr>
         <w:pStyle w:val="Compact"/>
       </w:pPr>
@@ -5167,7 +5264,7 @@
       <w:pPr>
         <w:numPr>
           <w:ilvl w:val="0"/>
-          <w:numId w:val="1023"/>
+          <w:numId w:val="1024"/>
         </w:numPr>
         <w:pStyle w:val="Compact"/>
       </w:pPr>
@@ -5179,7 +5276,7 @@
       <w:pPr>
         <w:numPr>
           <w:ilvl w:val="0"/>
-          <w:numId w:val="1023"/>
+          <w:numId w:val="1024"/>
         </w:numPr>
         <w:pStyle w:val="Compact"/>
       </w:pPr>
@@ -5191,7 +5288,7 @@
       <w:pPr>
         <w:numPr>
           <w:ilvl w:val="0"/>
-          <w:numId w:val="1023"/>
+          <w:numId w:val="1024"/>
         </w:numPr>
         <w:pStyle w:val="Compact"/>
       </w:pPr>
@@ -5264,7 +5361,7 @@
       <w:pPr>
         <w:numPr>
           <w:ilvl w:val="0"/>
-          <w:numId w:val="1024"/>
+          <w:numId w:val="1025"/>
         </w:numPr>
         <w:pStyle w:val="Compact"/>
       </w:pPr>
@@ -5276,7 +5373,7 @@
       <w:pPr>
         <w:numPr>
           <w:ilvl w:val="0"/>
-          <w:numId w:val="1024"/>
+          <w:numId w:val="1025"/>
         </w:numPr>
         <w:pStyle w:val="Compact"/>
       </w:pPr>
@@ -5288,7 +5385,7 @@
       <w:pPr>
         <w:numPr>
           <w:ilvl w:val="0"/>
-          <w:numId w:val="1024"/>
+          <w:numId w:val="1025"/>
         </w:numPr>
         <w:pStyle w:val="Compact"/>
       </w:pPr>
@@ -5300,7 +5397,7 @@
       <w:pPr>
         <w:numPr>
           <w:ilvl w:val="0"/>
-          <w:numId w:val="1024"/>
+          <w:numId w:val="1025"/>
         </w:numPr>
         <w:pStyle w:val="Compact"/>
       </w:pPr>
@@ -5312,7 +5409,7 @@
       <w:pPr>
         <w:numPr>
           <w:ilvl w:val="0"/>
-          <w:numId w:val="1024"/>
+          <w:numId w:val="1025"/>
         </w:numPr>
         <w:pStyle w:val="Compact"/>
       </w:pPr>
@@ -5770,6 +5867,9 @@
     <w:abstractNumId w:val="991"/>
   </w:num>
   <w:num w:numId="1024">
+    <w:abstractNumId w:val="991"/>
+  </w:num>
+  <w:num w:numId="1025">
     <w:abstractNumId w:val="991"/>
   </w:num>
 </w:numbering>

</xml_diff>